<commit_message>
fix: change text in non-functional requirements
</commit_message>
<xml_diff>
--- a/docs/semester-6/task3.docx
+++ b/docs/semester-6/task3.docx
@@ -163,83 +163,37 @@
       <w:pPr>
         <w:spacing w:after="120"/>
         <w:jc w:val="center"/>
-      </w:pPr>
-      <w:proofErr w:type="spellStart"/>
+        <w:rPr>
+          <w:lang w:val="ru-RU"/>
+        </w:rPr>
+      </w:pPr>
       <w:r>
         <w:rPr>
           <w:b/>
           <w:bCs/>
           <w:sz w:val="28"/>
           <w:szCs w:val="28"/>
-        </w:rPr>
-        <w:t>Отчет</w:t>
-      </w:r>
-      <w:proofErr w:type="spellEnd"/>
+          <w:lang w:val="ru-RU"/>
+        </w:rPr>
+        <w:t xml:space="preserve">Отчет по заданию </w:t>
+      </w:r>
       <w:r>
         <w:rPr>
           <w:b/>
           <w:bCs/>
           <w:sz w:val="28"/>
           <w:szCs w:val="28"/>
-        </w:rPr>
-        <w:t xml:space="preserve"> </w:t>
-      </w:r>
-      <w:proofErr w:type="spellStart"/>
+          <w:lang w:val="ru-RU"/>
+        </w:rPr>
+        <w:t>№</w:t>
+      </w:r>
       <w:r>
         <w:rPr>
           <w:b/>
           <w:bCs/>
           <w:sz w:val="28"/>
           <w:szCs w:val="28"/>
-        </w:rPr>
-        <w:t>по</w:t>
-      </w:r>
-      <w:proofErr w:type="spellEnd"/>
-      <w:r>
-        <w:rPr>
-          <w:b/>
-          <w:bCs/>
-          <w:sz w:val="28"/>
-          <w:szCs w:val="28"/>
-        </w:rPr>
-        <w:t xml:space="preserve"> </w:t>
-      </w:r>
-      <w:proofErr w:type="spellStart"/>
-      <w:r>
-        <w:rPr>
-          <w:b/>
-          <w:bCs/>
-          <w:sz w:val="28"/>
-          <w:szCs w:val="28"/>
-        </w:rPr>
-        <w:t>заданию</w:t>
-      </w:r>
-      <w:proofErr w:type="spellEnd"/>
-      <w:r>
-        <w:rPr>
-          <w:b/>
-          <w:bCs/>
-          <w:sz w:val="28"/>
-          <w:szCs w:val="28"/>
-        </w:rPr>
-        <w:t xml:space="preserve"> </w:t>
-      </w:r>
-      <w:r>
-        <w:rPr>
-          <w:b/>
-          <w:bCs/>
-          <w:sz w:val="28"/>
-          <w:szCs w:val="28"/>
-          <w:lang w:val="ru-RU"/>
-        </w:rPr>
-        <w:t>№</w:t>
-      </w:r>
-      <w:r>
-        <w:rPr>
-          <w:b/>
-          <w:bCs/>
-          <w:sz w:val="28"/>
-          <w:szCs w:val="28"/>
+          <w:lang w:val="ru-RU"/>
         </w:rPr>
         <w:t xml:space="preserve"> 3</w:t>
       </w:r>
@@ -1255,7 +1209,19 @@
         <w:rPr>
           <w:lang w:val="ru-RU"/>
         </w:rPr>
-        <w:t>9. Инспектор закрывает тревогу в приложении, выбирая статус «Нарушение зафиксировано, акт составлен».</w:t>
+        <w:t xml:space="preserve">9. Инспектор закрывает тревогу в приложении, выбирая статус «Нарушение </w:t>
+      </w:r>
+      <w:r>
+        <w:rPr>
+          <w:lang w:val="ru-RU"/>
+        </w:rPr>
+        <w:t>устранено</w:t>
+      </w:r>
+      <w:r>
+        <w:rPr>
+          <w:lang w:val="ru-RU"/>
+        </w:rPr>
+        <w:t>».</w:t>
       </w:r>
     </w:p>
     <w:p>

</xml_diff>